<commit_message>
Old change - i don't know
</commit_message>
<xml_diff>
--- a/ReqRepo - Vision and Scope.docx
+++ b/ReqRepo - Vision and Scope.docx
@@ -2645,6 +2645,9 @@
           <w:color w:val="000000"/>
         </w:rPr>
       </w:pPr>
+      <w:bookmarkStart w:id="8" w:name="OLE_LINK1"/>
+      <w:bookmarkStart w:id="9" w:name="OLE_LINK2"/>
+      <w:bookmarkStart w:id="10" w:name="_GoBack"/>
       <w:r>
         <w:rPr>
           <w:rFonts w:ascii="Arial" w:eastAsia="Times New Roman" w:hAnsi="Arial" w:cs="Arial"/>
@@ -2892,6 +2895,9 @@
         <w:t>External Files</w:t>
       </w:r>
     </w:p>
+    <w:bookmarkEnd w:id="8"/>
+    <w:bookmarkEnd w:id="9"/>
+    <w:bookmarkEnd w:id="10"/>
     <w:p>
       <w:pPr>
         <w:pStyle w:val="ListParagraph"/>
@@ -2916,11 +2922,11 @@
         </w:numPr>
         <w:ind w:left="431" w:hanging="431"/>
       </w:pPr>
-      <w:bookmarkStart w:id="8" w:name="_Toc303807214"/>
+      <w:bookmarkStart w:id="11" w:name="_Toc303807214"/>
       <w:r>
         <w:t>Major Features</w:t>
       </w:r>
-      <w:bookmarkEnd w:id="8"/>
+      <w:bookmarkEnd w:id="11"/>
     </w:p>
     <w:tbl>
       <w:tblPr>
@@ -3991,12 +3997,12 @@
         </w:numPr>
         <w:ind w:left="431" w:hanging="431"/>
       </w:pPr>
-      <w:bookmarkStart w:id="9" w:name="_Toc303807215"/>
+      <w:bookmarkStart w:id="12" w:name="_Toc303807215"/>
       <w:r>
         <w:lastRenderedPageBreak/>
         <w:t>Assumptions and Dependencies</w:t>
       </w:r>
-      <w:bookmarkEnd w:id="9"/>
+      <w:bookmarkEnd w:id="12"/>
     </w:p>
     <w:p>
       <w:r>
@@ -4011,11 +4017,11 @@
           <w:numId w:val="11"/>
         </w:numPr>
       </w:pPr>
-      <w:bookmarkStart w:id="10" w:name="_Toc303807216"/>
+      <w:bookmarkStart w:id="13" w:name="_Toc303807216"/>
       <w:r>
         <w:t>Scope and Limitations</w:t>
       </w:r>
-      <w:bookmarkEnd w:id="10"/>
+      <w:bookmarkEnd w:id="13"/>
     </w:p>
     <w:p>
       <w:pPr>
@@ -4026,7 +4032,7 @@
         </w:numPr>
         <w:ind w:left="431" w:hanging="431"/>
       </w:pPr>
-      <w:bookmarkStart w:id="11" w:name="_Toc303807217"/>
+      <w:bookmarkStart w:id="14" w:name="_Toc303807217"/>
       <w:r>
         <w:t>Scope of</w:t>
       </w:r>
@@ -4042,7 +4048,7 @@
       <w:r>
         <w:t>s</w:t>
       </w:r>
-      <w:bookmarkEnd w:id="11"/>
+      <w:bookmarkEnd w:id="14"/>
     </w:p>
     <w:tbl>
       <w:tblPr>
@@ -7050,11 +7056,11 @@
         </w:numPr>
         <w:ind w:left="431" w:hanging="431"/>
       </w:pPr>
-      <w:bookmarkStart w:id="12" w:name="_Toc303807218"/>
+      <w:bookmarkStart w:id="15" w:name="_Toc303807218"/>
       <w:r>
         <w:t>Limitations and Exclusions</w:t>
       </w:r>
-      <w:bookmarkEnd w:id="12"/>
+      <w:bookmarkEnd w:id="15"/>
     </w:p>
     <w:tbl>
       <w:tblPr>
@@ -7133,12 +7139,12 @@
           <w:numId w:val="11"/>
         </w:numPr>
       </w:pPr>
-      <w:bookmarkStart w:id="13" w:name="_Toc303807219"/>
+      <w:bookmarkStart w:id="16" w:name="_Toc303807219"/>
       <w:r>
         <w:lastRenderedPageBreak/>
         <w:t>Business Context</w:t>
       </w:r>
-      <w:bookmarkEnd w:id="13"/>
+      <w:bookmarkEnd w:id="16"/>
     </w:p>
     <w:p>
       <w:pPr>
@@ -7149,11 +7155,11 @@
         </w:numPr>
         <w:ind w:left="431" w:hanging="431"/>
       </w:pPr>
-      <w:bookmarkStart w:id="14" w:name="_Toc303807220"/>
+      <w:bookmarkStart w:id="17" w:name="_Toc303807220"/>
       <w:r>
         <w:t>Stakeholder Profiles</w:t>
       </w:r>
-      <w:bookmarkEnd w:id="14"/>
+      <w:bookmarkEnd w:id="17"/>
     </w:p>
     <w:p>
       <w:r>
@@ -7169,11 +7175,11 @@
         </w:numPr>
         <w:ind w:left="431" w:hanging="431"/>
       </w:pPr>
-      <w:bookmarkStart w:id="15" w:name="_Toc303807221"/>
+      <w:bookmarkStart w:id="18" w:name="_Toc303807221"/>
       <w:r>
         <w:t>Project Priorities</w:t>
       </w:r>
-      <w:bookmarkEnd w:id="15"/>
+      <w:bookmarkEnd w:id="18"/>
     </w:p>
     <w:tbl>
       <w:tblPr>
@@ -7606,11 +7612,11 @@
         </w:numPr>
         <w:ind w:left="431" w:hanging="431"/>
       </w:pPr>
-      <w:bookmarkStart w:id="16" w:name="_Toc303807222"/>
+      <w:bookmarkStart w:id="19" w:name="_Toc303807222"/>
       <w:r>
         <w:t>Operating Environment</w:t>
       </w:r>
-      <w:bookmarkEnd w:id="16"/>
+      <w:bookmarkEnd w:id="19"/>
     </w:p>
     <w:p>
       <w:r>
@@ -7987,12 +7993,7 @@
         <w:spacing w:after="0" w:line="240" w:lineRule="auto"/>
       </w:pPr>
       <w:r>
-        <w:t xml:space="preserve">Live </w:t>
-      </w:r>
-      <w:bookmarkStart w:id="17" w:name="_GoBack"/>
-      <w:bookmarkEnd w:id="17"/>
-      <w:r>
-        <w:t>updates</w:t>
+        <w:t>Live updates</w:t>
       </w:r>
     </w:p>
     <w:p>
@@ -13982,7 +13983,7 @@
 </file>
 
 <file path=customXml/itemProps1.xml><?xml version="1.0" encoding="utf-8"?>
-<ds:datastoreItem xmlns:ds="http://schemas.openxmlformats.org/officeDocument/2006/customXml" ds:itemID="{E2762B09-95EE-4BE7-A130-6B2CDEC3CBFC}">
+<ds:datastoreItem xmlns:ds="http://schemas.openxmlformats.org/officeDocument/2006/customXml" ds:itemID="{0A638966-A1BF-4F0C-BE1C-F198C4A622F3}">
   <ds:schemaRefs>
     <ds:schemaRef ds:uri="http://schemas.openxmlformats.org/officeDocument/2006/bibliography"/>
   </ds:schemaRefs>

</xml_diff>